<commit_message>
impressão em pdf  corrigido
</commit_message>
<xml_diff>
--- a/templates/4 - procuração - joaçaba.docx
+++ b/templates/4 - procuração - joaçaba.docx
@@ -49,7 +49,21 @@
         <w:rPr>
           <w:rFonts w:cstheme="minorHAnsi"/>
         </w:rPr>
-        <w:t>{{cpf_cnpj}}</w:t>
+        <w:t>{{</w:t>
+      </w:r>
+      <w:proofErr w:type="spellStart"/>
+      <w:r>
+        <w:rPr>
+          <w:rFonts w:cstheme="minorHAnsi"/>
+        </w:rPr>
+        <w:t>cpf_cnpj</w:t>
+      </w:r>
+      <w:proofErr w:type="spellEnd"/>
+      <w:r>
+        <w:rPr>
+          <w:rFonts w:cstheme="minorHAnsi"/>
+        </w:rPr>
+        <w:t>}}</w:t>
       </w:r>
       <w:r>
         <w:t xml:space="preserve">, residente e domiciliado </w:t>
@@ -181,13 +195,29 @@
         <w:t xml:space="preserve">, o valor total proveniente da participação financeira da CELESC, diretamente ao outorgado, montante de </w:t>
       </w:r>
       <w:r>
-        <w:t>{{valor devolução}} {{valor extenso}}</w:t>
+        <w:t>{{valor devolução}} {{</w:t>
+      </w:r>
+      <w:proofErr w:type="spellStart"/>
+      <w:r>
+        <w:t>valor_devolucao_extenso</w:t>
+      </w:r>
+      <w:proofErr w:type="spellEnd"/>
+      <w:r>
+        <w:t>}}</w:t>
       </w:r>
       <w:r>
         <w:t xml:space="preserve">, conforme Carta Orçamentária, referente Nota PS </w:t>
       </w:r>
       <w:r>
-        <w:t>{{nota_ps}}</w:t>
+        <w:t>{{</w:t>
+      </w:r>
+      <w:proofErr w:type="spellStart"/>
+      <w:r>
+        <w:t>nota_ps</w:t>
+      </w:r>
+      <w:proofErr w:type="spellEnd"/>
+      <w:r>
+        <w:t>}}</w:t>
       </w:r>
       <w:r>
         <w:t xml:space="preserve">, sobre projeto de extensão de rede, situado na </w:t>
@@ -209,7 +239,21 @@
         <w:rPr>
           <w:rFonts w:cstheme="minorHAnsi"/>
         </w:rPr>
-        <w:t>{{nome}} – {cpf_cnpj}}</w:t>
+        <w:t>{{nome}} – {</w:t>
+      </w:r>
+      <w:proofErr w:type="spellStart"/>
+      <w:r>
+        <w:rPr>
+          <w:rFonts w:cstheme="minorHAnsi"/>
+        </w:rPr>
+        <w:t>cpf_cnpj</w:t>
+      </w:r>
+      <w:proofErr w:type="spellEnd"/>
+      <w:r>
+        <w:rPr>
+          <w:rFonts w:cstheme="minorHAnsi"/>
+        </w:rPr>
+        <w:t>}}</w:t>
       </w:r>
     </w:p>
     <w:p/>
@@ -839,7 +883,6 @@
   <w:style w:type="character" w:default="1" w:styleId="Fontepargpadro">
     <w:name w:val="Default Paragraph Font"/>
     <w:uiPriority w:val="1"/>
-    <w:semiHidden/>
     <w:unhideWhenUsed/>
   </w:style>
   <w:style w:type="table" w:default="1" w:styleId="Tabelanormal">

</xml_diff>